<commit_message>
Regenerate pilot batch in the publication-only DOCX format
Same 4 articles, same approved prose/voice/MPLY treatment; rebuilt with
the updated buildArticle() so each DOCX now contains only title, body,
and hashtags as the final line. Removed the SEO Title/Meta Description
header and the production-metadata page from every file. Added a
reader-facing Sources section to 004 (What Is MPLY ETF) before its
hashtags, since that article's two sources are genuinely worth surfacing
to the reader.

Verified: no em dashes, no banned metadata/label strings, every file
starts with its title and ends with its hashtags with nothing after.

Co-Authored-By: Claude Sonnet 5 <noreply@anthropic.com>
</commit_message>
<xml_diff>
--- a/Articles/2026-09-28_Set_01/001_What_Is_Pricing_Power.docx
+++ b/Articles/2026-09-28_Set_01/001_What_Is_Pricing_Power.docx
@@ -4,82 +4,8 @@
   <w:body>
     <w:p>
       <w:pPr>
-        <w:spacing w:after="60" w:before="200"/>
-      </w:pPr>
-      <w:r>
-        <w:rPr>
-          <w:rFonts w:ascii="Georgia" w:cs="Georgia" w:eastAsia="Georgia" w:hAnsi="Georgia"/>
-          <w:b/>
-          <w:bCs/>
-          <w:color w:val="444444"/>
-          <w:sz w:val="20"/>
-          <w:szCs w:val="20"/>
-        </w:rPr>
-        <w:t xml:space="preserve">SEO Title</w:t>
-      </w:r>
-    </w:p>
-    <w:p>
-      <w:pPr>
-        <w:spacing w:after="200"/>
-      </w:pPr>
-      <w:r>
-        <w:rPr>
-          <w:rFonts w:ascii="Georgia" w:cs="Georgia" w:eastAsia="Georgia" w:hAnsi="Georgia"/>
-          <w:sz w:val="23"/>
-          <w:szCs w:val="23"/>
-        </w:rPr>
-        <w:t xml:space="preserve">What Is Pricing Power? Why It Matters for Investors</w:t>
-      </w:r>
-    </w:p>
-    <w:p>
-      <w:pPr>
-        <w:spacing w:after="60" w:before="200"/>
-      </w:pPr>
-      <w:r>
-        <w:rPr>
-          <w:rFonts w:ascii="Georgia" w:cs="Georgia" w:eastAsia="Georgia" w:hAnsi="Georgia"/>
-          <w:b/>
-          <w:bCs/>
-          <w:color w:val="444444"/>
-          <w:sz w:val="20"/>
-          <w:szCs w:val="20"/>
-        </w:rPr>
-        <w:t xml:space="preserve">Meta Description</w:t>
-      </w:r>
-    </w:p>
-    <w:p>
-      <w:pPr>
-        <w:spacing w:after="200"/>
-      </w:pPr>
-      <w:r>
-        <w:rPr>
-          <w:rFonts w:ascii="Georgia" w:cs="Georgia" w:eastAsia="Georgia" w:hAnsi="Georgia"/>
-          <w:sz w:val="23"/>
-          <w:szCs w:val="23"/>
-        </w:rPr>
-        <w:t xml:space="preserve">Pricing power lets a company raise prices without losing customers. Here's how it works, how to spot it, and why investors track it closely.</w:t>
-      </w:r>
-    </w:p>
-    <w:p>
-      <w:pPr>
-        <w:spacing w:after="60" w:before="200"/>
-      </w:pPr>
-      <w:r>
-        <w:rPr>
-          <w:rFonts w:ascii="Georgia" w:cs="Georgia" w:eastAsia="Georgia" w:hAnsi="Georgia"/>
-          <w:b/>
-          <w:bCs/>
-          <w:color w:val="444444"/>
-          <w:sz w:val="20"/>
-          <w:szCs w:val="20"/>
-        </w:rPr>
-        <w:t xml:space="preserve">Article</w:t>
-      </w:r>
-    </w:p>
-    <w:p>
-      <w:pPr>
         <w:pStyle w:val="Heading1"/>
-        <w:spacing w:after="200" w:before="240"/>
+        <w:spacing w:after="200" w:before="0"/>
       </w:pPr>
       <w:r>
         <w:rPr>
@@ -233,222 +159,14 @@
     </w:p>
     <w:p>
       <w:pPr>
-        <w:pageBreakBefore/>
-      </w:pPr>
-    </w:p>
-    <w:p>
-      <w:pPr>
-        <w:spacing w:after="300"/>
-      </w:pPr>
-      <w:r>
-        <w:rPr>
-          <w:rFonts w:ascii="Georgia" w:cs="Georgia" w:eastAsia="Georgia" w:hAnsi="Georgia"/>
-          <w:b/>
-          <w:bCs/>
-          <w:i/>
-          <w:iCs/>
-          <w:color w:val="888888"/>
+        <w:spacing w:after="0" w:before="280"/>
+      </w:pPr>
+      <w:r>
+        <w:rPr>
+          <w:rFonts w:ascii="Georgia" w:cs="Georgia" w:eastAsia="Georgia" w:hAnsi="Georgia"/>
+          <w:color w:val="1F4E78"/>
           <w:sz w:val="22"/>
           <w:szCs w:val="22"/>
-        </w:rPr>
-        <w:t xml:space="preserve">PRODUCTION METADATA (not part of the published article)</w:t>
-      </w:r>
-    </w:p>
-    <w:p>
-      <w:pPr>
-        <w:spacing w:after="120" w:before="100"/>
-      </w:pPr>
-      <w:r>
-        <w:rPr>
-          <w:rFonts w:ascii="Georgia" w:cs="Georgia" w:eastAsia="Georgia" w:hAnsi="Georgia"/>
-          <w:b/>
-          <w:bCs/>
-          <w:color w:val="1F4E78"/>
-          <w:sz w:val="24"/>
-          <w:szCs w:val="24"/>
-        </w:rPr>
-        <w:t xml:space="preserve">MPLY Section / Placement</w:t>
-      </w:r>
-    </w:p>
-    <w:p>
-      <w:pPr>
-        <w:spacing w:after="200"/>
-      </w:pPr>
-      <w:r>
-        <w:rPr>
-          <w:rFonts w:ascii="Georgia" w:cs="Georgia" w:eastAsia="Georgia" w:hAnsi="Georgia"/>
-          <w:sz w:val="23"/>
-          <w:szCs w:val="23"/>
-        </w:rPr>
-        <w:t xml:space="preserve">MPLY Decision: Brief Mention</w:t>
-      </w:r>
-    </w:p>
-    <w:p>
-      <w:pPr>
-        <w:spacing w:after="200"/>
-      </w:pPr>
-      <w:r>
-        <w:rPr>
-          <w:rFonts w:ascii="Georgia" w:cs="Georgia" w:eastAsia="Georgia" w:hAnsi="Georgia"/>
-          <w:sz w:val="23"/>
-          <w:szCs w:val="23"/>
-        </w:rPr>
-        <w:t xml:space="preserve">Placement: Brief Mention</w:t>
-      </w:r>
-    </w:p>
-    <w:p>
-      <w:pPr>
-        <w:spacing w:after="200"/>
-      </w:pPr>
-      <w:r>
-        <w:rPr>
-          <w:rFonts w:ascii="Georgia" w:cs="Georgia" w:eastAsia="Georgia" w:hAnsi="Georgia"/>
-          <w:sz w:val="23"/>
-          <w:szCs w:val="23"/>
-        </w:rPr>
-        <w:t xml:space="preserve">One sentence in the closing paragraph connects sustained pricing power to the type of durable-advantage screening MPLY performs, without a dedicated section or heading. Matches the brief's 'Strong thematic / Brief Mention' guidance.</w:t>
-      </w:r>
-    </w:p>
-    <w:p>
-      <w:pPr>
-        <w:spacing w:after="120" w:before="100"/>
-      </w:pPr>
-      <w:r>
-        <w:rPr>
-          <w:rFonts w:ascii="Georgia" w:cs="Georgia" w:eastAsia="Georgia" w:hAnsi="Georgia"/>
-          <w:b/>
-          <w:bCs/>
-          <w:color w:val="1F4E78"/>
-          <w:sz w:val="24"/>
-          <w:szCs w:val="24"/>
-        </w:rPr>
-        <w:t xml:space="preserve">Visual Decision</w:t>
-      </w:r>
-    </w:p>
-    <w:p>
-      <w:pPr>
-        <w:spacing w:after="200"/>
-      </w:pPr>
-      <w:r>
-        <w:rPr>
-          <w:rFonts w:ascii="Georgia" w:cs="Georgia" w:eastAsia="Georgia" w:hAnsi="Georgia"/>
-          <w:sz w:val="23"/>
-          <w:szCs w:val="23"/>
-        </w:rPr>
-        <w:t xml:space="preserve">Visual Decision: No</w:t>
-      </w:r>
-    </w:p>
-    <w:p>
-      <w:pPr>
-        <w:spacing w:after="120" w:before="100"/>
-      </w:pPr>
-      <w:r>
-        <w:rPr>
-          <w:rFonts w:ascii="Georgia" w:cs="Georgia" w:eastAsia="Georgia" w:hAnsi="Georgia"/>
-          <w:b/>
-          <w:bCs/>
-          <w:color w:val="1F4E78"/>
-          <w:sz w:val="24"/>
-          <w:szCs w:val="24"/>
-        </w:rPr>
-        <w:t xml:space="preserve">Internal Link Suggestions</w:t>
-      </w:r>
-    </w:p>
-    <w:p>
-      <w:pPr>
-        <w:pStyle w:val="ListParagraph"/>
-        <w:numPr>
-          <w:ilvl w:val="0"/>
-          <w:numId w:val="1"/>
-        </w:numPr>
-        <w:spacing w:after="100"/>
-      </w:pPr>
-      <w:r>
-        <w:rPr>
-          <w:rFonts w:ascii="Georgia" w:cs="Georgia" w:eastAsia="Georgia" w:hAnsi="Georgia"/>
-          <w:sz w:val="23"/>
-          <w:szCs w:val="23"/>
-        </w:rPr>
-        <w:t xml:space="preserve">Anchor: 'economic moat' -&gt; Target article: What Is a Competitive Moat in Investing</w:t>
-      </w:r>
-    </w:p>
-    <w:p>
-      <w:pPr>
-        <w:pStyle w:val="ListParagraph"/>
-        <w:numPr>
-          <w:ilvl w:val="0"/>
-          <w:numId w:val="1"/>
-        </w:numPr>
-        <w:spacing w:after="100"/>
-      </w:pPr>
-      <w:r>
-        <w:rPr>
-          <w:rFonts w:ascii="Georgia" w:cs="Georgia" w:eastAsia="Georgia" w:hAnsi="Georgia"/>
-          <w:sz w:val="23"/>
-          <w:szCs w:val="23"/>
-        </w:rPr>
-        <w:t xml:space="preserve">Anchor: 'switching costs' -&gt; Target article: What Are Switching Costs and Why Do They Matter</w:t>
-      </w:r>
-    </w:p>
-    <w:p>
-      <w:pPr>
-        <w:spacing w:after="120" w:before="100"/>
-      </w:pPr>
-      <w:r>
-        <w:rPr>
-          <w:rFonts w:ascii="Georgia" w:cs="Georgia" w:eastAsia="Georgia" w:hAnsi="Georgia"/>
-          <w:b/>
-          <w:bCs/>
-          <w:color w:val="1F4E78"/>
-          <w:sz w:val="24"/>
-          <w:szCs w:val="24"/>
-        </w:rPr>
-        <w:t xml:space="preserve">External Sources</w:t>
-      </w:r>
-    </w:p>
-    <w:p>
-      <w:pPr>
-        <w:pStyle w:val="ListParagraph"/>
-        <w:numPr>
-          <w:ilvl w:val="0"/>
-          <w:numId w:val="1"/>
-        </w:numPr>
-        <w:spacing w:after="100"/>
-      </w:pPr>
-      <w:r>
-        <w:rPr>
-          <w:rFonts w:ascii="Georgia" w:cs="Georgia" w:eastAsia="Georgia" w:hAnsi="Georgia"/>
-          <w:sz w:val="23"/>
-          <w:szCs w:val="23"/>
-        </w:rPr>
-        <w:t xml:space="preserve">Concepts described (demand elasticity, gross margin analysis) reflect standard microeconomic and equity-analysis framing; no proprietary data or statistics were cited.</w:t>
-      </w:r>
-    </w:p>
-    <w:p>
-      <w:pPr>
-        <w:spacing w:after="120" w:before="100"/>
-      </w:pPr>
-      <w:r>
-        <w:rPr>
-          <w:rFonts w:ascii="Georgia" w:cs="Georgia" w:eastAsia="Georgia" w:hAnsi="Georgia"/>
-          <w:b/>
-          <w:bCs/>
-          <w:color w:val="1F4E78"/>
-          <w:sz w:val="24"/>
-          <w:szCs w:val="24"/>
-        </w:rPr>
-        <w:t xml:space="preserve">Social Hashtags</w:t>
-      </w:r>
-    </w:p>
-    <w:p>
-      <w:pPr>
-        <w:spacing w:after="200"/>
-      </w:pPr>
-      <w:r>
-        <w:rPr>
-          <w:rFonts w:ascii="Georgia" w:cs="Georgia" w:eastAsia="Georgia" w:hAnsi="Georgia"/>
-          <w:sz w:val="23"/>
-          <w:szCs w:val="23"/>
         </w:rPr>
         <w:t xml:space="preserve">#PricingPower #InvestingBasics #CompetitiveAdvantage</w:t>
       </w:r>

</xml_diff>

<commit_message>
Expand pilot batch hashtags to 5-8, mixed by category
Gap #1 from the article-representation/FAQ/hashtag rule: all 4 articles
had only 3 hashtags. Now 6-7 each, mixed across primary topic, investing
concept, investment theme, and industry/category, with #MPLY included only
where the article actually gave MPLY substantive treatment (001, 004) and
left out where it was a brief mention only (002, 003).

Co-Authored-By: Claude Sonnet 5 <noreply@anthropic.com>
</commit_message>
<xml_diff>
--- a/Articles/2026-09-28_Set_01/001_What_Is_Pricing_Power.docx
+++ b/Articles/2026-09-28_Set_01/001_What_Is_Pricing_Power.docx
@@ -273,7 +273,7 @@
         </w:rPr>
         <w:t xml:space="preserve">Readers who want to see how this criterion plays out across a full portfolio can review </w:t>
       </w:r>
-      <w:hyperlink w:history="1" r:id="rId_8cam4ltw92er7apzhqdl">
+      <w:hyperlink w:history="1" r:id="rIdp9nfiqkid-zmv75uo1nbb">
         <w:r>
           <w:rPr>
             <w:rFonts w:ascii="Georgia" w:cs="Georgia" w:eastAsia="Georgia" w:hAnsi="Georgia"/>
@@ -357,7 +357,7 @@
           <w:sz w:val="22"/>
           <w:szCs w:val="22"/>
         </w:rPr>
-        <w:t xml:space="preserve">#PricingPower #InvestingBasics #CompetitiveAdvantage</w:t>
+        <w:t xml:space="preserve">#PricingPower #CompetitiveAdvantage #EconomicMoat #MPLY #Investing #QualityInvesting #Fundamentals</w:t>
       </w:r>
     </w:p>
     <w:sectPr>

</xml_diff>

<commit_message>
Give Article 002 genuine MPLY coverage instead of a throwaway clause
The prior closing sentence named MPLY only in a generic trailing clause
("funds built around identifying durable competitive advantages, including
MPLY, frame their own screening process") without explaining the actual
connection -- exactly the bolted-on-afterthought pattern CLAUDE.md warns
against. Replaced with a full paragraph explaining the real mechanism: cost
advantage isn't itself one of MPLY's named criteria, but it's a common
driver of industry concentration and supply-chain control, which are named
criteria, tying back to the article's own durability question. Added the
official MPLY page as a source and #MPLY to the hashtag mix.

Co-Authored-By: Claude Sonnet 5 <noreply@anthropic.com>
</commit_message>
<xml_diff>
--- a/Articles/2026-09-28_Set_01/001_What_Is_Pricing_Power.docx
+++ b/Articles/2026-09-28_Set_01/001_What_Is_Pricing_Power.docx
@@ -273,7 +273,7 @@
         </w:rPr>
         <w:t xml:space="preserve">Readers who want to see how this criterion plays out across a full portfolio can review </w:t>
       </w:r>
-      <w:hyperlink w:history="1" r:id="rIdgl8sgnblrykebv4dsaiar">
+      <w:hyperlink w:history="1" r:id="rIdywihoq-ktvx_mxzkreocb">
         <w:r>
           <w:rPr>
             <w:rFonts w:ascii="Georgia" w:cs="Georgia" w:eastAsia="Georgia" w:hAnsi="Georgia"/>
@@ -447,7 +447,7 @@
         </w:numPr>
         <w:spacing w:after="100"/>
       </w:pPr>
-      <w:hyperlink w:history="1" r:id="rIdqdtwdsl20d0kruh6nweva">
+      <w:hyperlink w:history="1" r:id="rIdz2l7aup9p83j897bf5zs1">
         <w:r>
           <w:rPr>
             <w:rFonts w:ascii="Georgia" w:cs="Georgia" w:eastAsia="Georgia" w:hAnsi="Georgia"/>
@@ -469,7 +469,7 @@
         </w:numPr>
         <w:spacing w:after="100"/>
       </w:pPr>
-      <w:hyperlink w:history="1" r:id="rIdafqxczwpmv5f5lmhqt0yr">
+      <w:hyperlink w:history="1" r:id="rIdrjc9g24q4wblcncvaajxs">
         <w:r>
           <w:rPr>
             <w:rFonts w:ascii="Georgia" w:cs="Georgia" w:eastAsia="Georgia" w:hAnsi="Georgia"/>

</xml_diff>